<commit_message>
Run HW2 Part A against the census: real Block 3 results, plots, filled sheet
Co-Authored-By: Claude Opus 5.5 <noreply@anthropic.com>
Claude-Session: https://claude.ai/code/session_018yPRuzdXBHcgK1YMLDNk55
</commit_message>
<xml_diff>
--- a/week_08_hw2/HW2_Part_A_Answer_Sheet_filled.docx
+++ b/week_08_hw2/HW2_Part_A_Answer_Sheet_filled.docx
@@ -408,6 +408,12 @@
               <w:keepLines/>
               <w:spacing w:after="0" w:line="264" w:lineRule="auto"/>
             </w:pPr>
+            <w:r>
+              <w:rPr>
+                <w:sz w:val="21"/>
+              </w:rPr>
+              <w:t>73519</w:t>
+            </w:r>
           </w:p>
         </w:tc>
         <w:tc>
@@ -421,6 +427,12 @@
               <w:spacing w:after="0" w:line="264" w:lineRule="auto"/>
               <w:jc w:val="center"/>
             </w:pPr>
+            <w:r>
+              <w:rPr>
+                <w:sz w:val="21"/>
+              </w:rPr>
+              <w:t>0.504</w:t>
+            </w:r>
           </w:p>
         </w:tc>
         <w:tc>
@@ -434,6 +446,12 @@
               <w:spacing w:after="0" w:line="264" w:lineRule="auto"/>
               <w:jc w:val="center"/>
             </w:pPr>
+            <w:r>
+              <w:rPr>
+                <w:sz w:val="21"/>
+              </w:rPr>
+              <w:t>0.455</w:t>
+            </w:r>
           </w:p>
         </w:tc>
         <w:tc>
@@ -447,6 +465,12 @@
               <w:spacing w:after="0" w:line="264" w:lineRule="auto"/>
               <w:jc w:val="center"/>
             </w:pPr>
+            <w:r>
+              <w:rPr>
+                <w:sz w:val="21"/>
+              </w:rPr>
+              <w:t>0.553</w:t>
+            </w:r>
           </w:p>
         </w:tc>
         <w:tc>
@@ -460,6 +484,12 @@
               <w:spacing w:after="0" w:line="264" w:lineRule="auto"/>
               <w:jc w:val="center"/>
             </w:pPr>
+            <w:r>
+              <w:rPr>
+                <w:sz w:val="21"/>
+              </w:rPr>
+              <w:t>yes</w:t>
+            </w:r>
           </w:p>
         </w:tc>
       </w:tr>
@@ -528,6 +558,42 @@
               <w:keepLines/>
               <w:spacing w:after="0" w:line="264" w:lineRule="auto"/>
             </w:pPr>
+            <w:r>
+              <w:drawing>
+                <wp:inline distT="0" distB="0" distL="0" distR="0">
+                  <wp:extent cx="5669280" cy="3644537"/>
+                  <wp:docPr id="901" name="gazette_10000.png"/>
+                  <wp:cNvGraphicFramePr>
+                    <a:graphicFrameLocks xmlns:a="http://schemas.openxmlformats.org/drawingml/2006/main" noChangeAspect="1"/>
+                  </wp:cNvGraphicFramePr>
+                  <a:graphic xmlns:a="http://schemas.openxmlformats.org/drawingml/2006/main">
+                    <a:graphicData uri="http://schemas.openxmlformats.org/drawingml/2006/picture">
+                      <pic:pic xmlns:pic="http://schemas.openxmlformats.org/drawingml/2006/picture">
+                        <pic:nvPicPr>
+                          <pic:cNvPr id="901" name="gazette_10000.png"/>
+                          <pic:cNvPicPr/>
+                        </pic:nvPicPr>
+                        <pic:blipFill>
+                          <a:blip r:embed="rIdGaz10000"/>
+                          <a:stretch>
+                            <a:fillRect/>
+                          </a:stretch>
+                        </pic:blipFill>
+                        <pic:spPr>
+                          <a:xfrm>
+                            <a:off x="0" y="0"/>
+                            <a:ext cx="5669280" cy="3644537"/>
+                          </a:xfrm>
+                          <a:prstGeom prst="rect">
+                            <a:avLst/>
+                          </a:prstGeom>
+                        </pic:spPr>
+                      </pic:pic>
+                    </a:graphicData>
+                  </a:graphic>
+                </wp:inline>
+              </w:drawing>
+            </w:r>
           </w:p>
         </w:tc>
       </w:tr>
@@ -1016,7 +1082,7 @@
               <w:spacing w:after="0" w:line="264" w:lineRule="auto"/>
             </w:pPr>
             <w:r>
-              <w:t xml:space="preserve">About 5% of 280, or roughly 14 intervals, would miss the island's share. [Mine, from my_lower to my_upper, did / did not contain 50.2%; fill in from block 3.] Without a census, a student could not find out that their interval missed: they see only their own sample, and an interval that misses looks just like one that hits.</w:t>
+              <w:t xml:space="preserve">About 5% of 280, or roughly 14 intervals, would miss the island's share. Mine was not one of them: my interval, from 45.5% to 55.3%, contained 50.2%. Without a census, a student could not find out that their interval missed: they see only their own sample, and an interval that misses looks just like one that hits.</w:t>
             </w:r>
           </w:p>
         </w:tc>

</xml_diff>